<commit_message>
Updated documentation, SQL scripts, ERD and screenshots
</commit_message>
<xml_diff>
--- a/DOCUMENTATION-27847.docx
+++ b/DOCUMENTATION-27847.docx
@@ -141,8 +141,16 @@
         <w:rPr>
           <w:rFonts w:ascii="Calibri Light" w:hAnsi="Calibri Light" w:cs="Calibri Light"/>
         </w:rPr>
-        <w:t xml:space="preserve"> Bridget Lwenyi</w:t>
-      </w:r>
+        <w:t xml:space="preserve"> Bridget </w:t>
+      </w:r>
+      <w:proofErr w:type="spellStart"/>
+      <w:r>
+        <w:rPr>
+          <w:rFonts w:ascii="Calibri Light" w:hAnsi="Calibri Light" w:cs="Calibri Light"/>
+        </w:rPr>
+        <w:t>Lwenyi</w:t>
+      </w:r>
+      <w:proofErr w:type="spellEnd"/>
     </w:p>
     <w:p>
       <w:pPr>
@@ -1736,797 +1744,6 @@
     </w:p>
     <w:p>
       <w:pPr>
-        <w:pStyle w:val="Title"/>
-        <w:rPr>
-          <w:rFonts w:ascii="Calibri Light" w:hAnsi="Calibri Light" w:cs="Calibri Light"/>
-        </w:rPr>
-      </w:pPr>
-      <w:r>
-        <w:rPr>
-          <w:rFonts w:ascii="Calibri Light" w:hAnsi="Calibri Light" w:cs="Calibri Light"/>
-        </w:rPr>
-        <w:t>ENTITY RELATIONSHIP DIAGRAM</w:t>
-      </w:r>
-    </w:p>
-    <w:p>
-      <w:pPr>
-        <w:rPr>
-          <w:rFonts w:ascii="Calibri Light" w:hAnsi="Calibri Light" w:cs="Calibri Light"/>
-          <w:sz w:val="56"/>
-          <w:szCs w:val="56"/>
-        </w:rPr>
-      </w:pPr>
-      <w:r>
-        <w:rPr>
-          <w:rFonts w:ascii="Calibri Light" w:hAnsi="Calibri Light" w:cs="Calibri Light"/>
-          <w:sz w:val="56"/>
-          <w:szCs w:val="56"/>
-        </w:rPr>
-        <w:t xml:space="preserve">                DEPARTMENTS</w:t>
-      </w:r>
-    </w:p>
-    <w:p>
-      <w:pPr>
-        <w:rPr>
-          <w:rFonts w:ascii="Calibri Light" w:hAnsi="Calibri Light" w:cs="Calibri Light"/>
-          <w:sz w:val="56"/>
-          <w:szCs w:val="56"/>
-        </w:rPr>
-      </w:pPr>
-      <w:r>
-        <w:rPr>
-          <w:rFonts w:ascii="Calibri Light" w:hAnsi="Calibri Light" w:cs="Calibri Light"/>
-          <w:sz w:val="56"/>
-          <w:szCs w:val="56"/>
-        </w:rPr>
-        <w:t xml:space="preserve">             -------------------</w:t>
-      </w:r>
-    </w:p>
-    <w:p>
-      <w:pPr>
-        <w:rPr>
-          <w:rFonts w:ascii="Calibri Light" w:hAnsi="Calibri Light" w:cs="Calibri Light"/>
-          <w:sz w:val="56"/>
-          <w:szCs w:val="56"/>
-        </w:rPr>
-      </w:pPr>
-      <w:r>
-        <w:rPr>
-          <w:rFonts w:ascii="Calibri Light" w:hAnsi="Calibri Light" w:cs="Calibri Light"/>
-          <w:sz w:val="56"/>
-          <w:szCs w:val="56"/>
-        </w:rPr>
-        <w:t xml:space="preserve">             Department _ID (PK)</w:t>
-      </w:r>
-    </w:p>
-    <w:p>
-      <w:pPr>
-        <w:rPr>
-          <w:rFonts w:ascii="Calibri Light" w:hAnsi="Calibri Light" w:cs="Calibri Light"/>
-          <w:sz w:val="56"/>
-          <w:szCs w:val="56"/>
-        </w:rPr>
-      </w:pPr>
-      <w:r>
-        <w:rPr>
-          <w:rFonts w:ascii="Calibri Light" w:hAnsi="Calibri Light" w:cs="Calibri Light"/>
-          <w:sz w:val="56"/>
-          <w:szCs w:val="56"/>
-        </w:rPr>
-        <w:t xml:space="preserve">             Name</w:t>
-      </w:r>
-    </w:p>
-    <w:p>
-      <w:pPr>
-        <w:rPr>
-          <w:rFonts w:ascii="Calibri Light" w:hAnsi="Calibri Light" w:cs="Calibri Light"/>
-          <w:sz w:val="56"/>
-          <w:szCs w:val="56"/>
-        </w:rPr>
-      </w:pPr>
-      <w:r>
-        <w:rPr>
-          <w:rFonts w:ascii="Calibri Light" w:hAnsi="Calibri Light" w:cs="Calibri Light"/>
-          <w:sz w:val="56"/>
-          <w:szCs w:val="56"/>
-        </w:rPr>
-        <w:t xml:space="preserve">             Location</w:t>
-      </w:r>
-    </w:p>
-    <w:p>
-      <w:pPr>
-        <w:rPr>
-          <w:rFonts w:ascii="Calibri Light" w:hAnsi="Calibri Light" w:cs="Calibri Light"/>
-          <w:sz w:val="56"/>
-          <w:szCs w:val="56"/>
-        </w:rPr>
-      </w:pPr>
-      <w:r>
-        <w:rPr>
-          <w:rFonts w:ascii="Calibri Light" w:hAnsi="Calibri Light" w:cs="Calibri Light"/>
-          <w:sz w:val="56"/>
-          <w:szCs w:val="56"/>
-        </w:rPr>
-        <w:t xml:space="preserve">             Head _Of _Department</w:t>
-      </w:r>
-    </w:p>
-    <w:p>
-      <w:pPr>
-        <w:rPr>
-          <w:rFonts w:ascii="Calibri Light" w:hAnsi="Calibri Light" w:cs="Calibri Light"/>
-          <w:sz w:val="56"/>
-          <w:szCs w:val="56"/>
-        </w:rPr>
-      </w:pPr>
-      <w:r>
-        <w:rPr>
-          <w:rFonts w:ascii="Calibri Light" w:hAnsi="Calibri Light" w:cs="Calibri Light"/>
-          <w:sz w:val="56"/>
-          <w:szCs w:val="56"/>
-        </w:rPr>
-        <w:t xml:space="preserve">                    |</w:t>
-      </w:r>
-    </w:p>
-    <w:p>
-      <w:pPr>
-        <w:rPr>
-          <w:rFonts w:ascii="Calibri Light" w:hAnsi="Calibri Light" w:cs="Calibri Light"/>
-          <w:sz w:val="56"/>
-          <w:szCs w:val="56"/>
-        </w:rPr>
-      </w:pPr>
-      <w:r>
-        <w:rPr>
-          <w:rFonts w:ascii="Calibri Light" w:hAnsi="Calibri Light" w:cs="Calibri Light"/>
-          <w:sz w:val="56"/>
-          <w:szCs w:val="56"/>
-        </w:rPr>
-        <w:t xml:space="preserve">          -----------------------</w:t>
-      </w:r>
-    </w:p>
-    <w:p>
-      <w:pPr>
-        <w:rPr>
-          <w:rFonts w:ascii="Calibri Light" w:hAnsi="Calibri Light" w:cs="Calibri Light"/>
-          <w:sz w:val="56"/>
-          <w:szCs w:val="56"/>
-        </w:rPr>
-      </w:pPr>
-      <w:r>
-        <w:rPr>
-          <w:rFonts w:ascii="Calibri Light" w:hAnsi="Calibri Light" w:cs="Calibri Light"/>
-          <w:sz w:val="56"/>
-          <w:szCs w:val="56"/>
-        </w:rPr>
-        <w:t xml:space="preserve">          |                     |</w:t>
-      </w:r>
-    </w:p>
-    <w:p>
-      <w:pPr>
-        <w:rPr>
-          <w:rFonts w:ascii="Calibri Light" w:hAnsi="Calibri Light" w:cs="Calibri Light"/>
-          <w:sz w:val="56"/>
-          <w:szCs w:val="56"/>
-        </w:rPr>
-      </w:pPr>
-      <w:r>
-        <w:rPr>
-          <w:rFonts w:ascii="Calibri Light" w:hAnsi="Calibri Light" w:cs="Calibri Light"/>
-          <w:sz w:val="56"/>
-          <w:szCs w:val="56"/>
-        </w:rPr>
-        <w:lastRenderedPageBreak/>
-        <w:t xml:space="preserve">          |                     |</w:t>
-      </w:r>
-    </w:p>
-    <w:p>
-      <w:pPr>
-        <w:rPr>
-          <w:rFonts w:ascii="Calibri Light" w:hAnsi="Calibri Light" w:cs="Calibri Light"/>
-          <w:sz w:val="56"/>
-          <w:szCs w:val="56"/>
-        </w:rPr>
-      </w:pPr>
-      <w:r>
-        <w:rPr>
-          <w:rFonts w:ascii="Calibri Light" w:hAnsi="Calibri Light" w:cs="Calibri Light"/>
-          <w:sz w:val="56"/>
-          <w:szCs w:val="56"/>
-        </w:rPr>
-        <w:t xml:space="preserve">      STUDENTS              STAFF</w:t>
-      </w:r>
-    </w:p>
-    <w:p>
-      <w:pPr>
-        <w:rPr>
-          <w:rFonts w:ascii="Calibri Light" w:hAnsi="Calibri Light" w:cs="Calibri Light"/>
-          <w:sz w:val="56"/>
-          <w:szCs w:val="56"/>
-        </w:rPr>
-      </w:pPr>
-      <w:r>
-        <w:rPr>
-          <w:rFonts w:ascii="Calibri Light" w:hAnsi="Calibri Light" w:cs="Calibri Light"/>
-          <w:sz w:val="56"/>
-          <w:szCs w:val="56"/>
-        </w:rPr>
-        <w:t xml:space="preserve">   ----------------      ----------------</w:t>
-      </w:r>
-    </w:p>
-    <w:p>
-      <w:pPr>
-        <w:rPr>
-          <w:rFonts w:ascii="Calibri Light" w:hAnsi="Calibri Light" w:cs="Calibri Light"/>
-          <w:sz w:val="56"/>
-          <w:szCs w:val="56"/>
-        </w:rPr>
-      </w:pPr>
-      <w:r>
-        <w:rPr>
-          <w:rFonts w:ascii="Calibri Light" w:hAnsi="Calibri Light" w:cs="Calibri Light"/>
-          <w:sz w:val="56"/>
-          <w:szCs w:val="56"/>
-        </w:rPr>
-        <w:t xml:space="preserve">   StudentID (PK)       StaffID (PK)</w:t>
-      </w:r>
-    </w:p>
-    <w:p>
-      <w:pPr>
-        <w:rPr>
-          <w:rFonts w:ascii="Calibri Light" w:hAnsi="Calibri Light" w:cs="Calibri Light"/>
-          <w:sz w:val="56"/>
-          <w:szCs w:val="56"/>
-        </w:rPr>
-      </w:pPr>
-      <w:r>
-        <w:rPr>
-          <w:rFonts w:ascii="Calibri Light" w:hAnsi="Calibri Light" w:cs="Calibri Light"/>
-          <w:sz w:val="56"/>
-          <w:szCs w:val="56"/>
-        </w:rPr>
-        <w:t xml:space="preserve">   Name                 Name</w:t>
-      </w:r>
-    </w:p>
-    <w:p>
-      <w:pPr>
-        <w:rPr>
-          <w:rFonts w:ascii="Calibri Light" w:hAnsi="Calibri Light" w:cs="Calibri Light"/>
-          <w:sz w:val="56"/>
-          <w:szCs w:val="56"/>
-        </w:rPr>
-      </w:pPr>
-      <w:r>
-        <w:rPr>
-          <w:rFonts w:ascii="Calibri Light" w:hAnsi="Calibri Light" w:cs="Calibri Light"/>
-          <w:sz w:val="56"/>
-          <w:szCs w:val="56"/>
-        </w:rPr>
-        <w:t xml:space="preserve">   DateOfBirth          Role</w:t>
-      </w:r>
-    </w:p>
-    <w:p>
-      <w:pPr>
-        <w:rPr>
-          <w:rFonts w:ascii="Calibri Light" w:hAnsi="Calibri Light" w:cs="Calibri Light"/>
-          <w:sz w:val="56"/>
-          <w:szCs w:val="56"/>
-        </w:rPr>
-      </w:pPr>
-      <w:r>
-        <w:rPr>
-          <w:rFonts w:ascii="Calibri Light" w:hAnsi="Calibri Light" w:cs="Calibri Light"/>
-          <w:sz w:val="56"/>
-          <w:szCs w:val="56"/>
-        </w:rPr>
-        <w:t xml:space="preserve">   Gender               DepartmentID (FK)</w:t>
-      </w:r>
-    </w:p>
-    <w:p>
-      <w:pPr>
-        <w:rPr>
-          <w:rFonts w:ascii="Calibri Light" w:hAnsi="Calibri Light" w:cs="Calibri Light"/>
-          <w:sz w:val="56"/>
-          <w:szCs w:val="56"/>
-        </w:rPr>
-      </w:pPr>
-      <w:r>
-        <w:rPr>
-          <w:rFonts w:ascii="Calibri Light" w:hAnsi="Calibri Light" w:cs="Calibri Light"/>
-          <w:sz w:val="56"/>
-          <w:szCs w:val="56"/>
-        </w:rPr>
-        <w:t xml:space="preserve">   DepartmentID (FK)    Email</w:t>
-      </w:r>
-    </w:p>
-    <w:p>
-      <w:pPr>
-        <w:rPr>
-          <w:rFonts w:ascii="Calibri Light" w:hAnsi="Calibri Light" w:cs="Calibri Light"/>
-          <w:sz w:val="56"/>
-          <w:szCs w:val="56"/>
-        </w:rPr>
-      </w:pPr>
-      <w:r>
-        <w:rPr>
-          <w:rFonts w:ascii="Calibri Light" w:hAnsi="Calibri Light" w:cs="Calibri Light"/>
-          <w:sz w:val="56"/>
-          <w:szCs w:val="56"/>
-        </w:rPr>
-        <w:t xml:space="preserve">   Email</w:t>
-      </w:r>
-    </w:p>
-    <w:p>
-      <w:pPr>
-        <w:rPr>
-          <w:rFonts w:ascii="Calibri Light" w:hAnsi="Calibri Light" w:cs="Calibri Light"/>
-          <w:sz w:val="56"/>
-          <w:szCs w:val="56"/>
-        </w:rPr>
-      </w:pPr>
-    </w:p>
-    <w:p>
-      <w:pPr>
-        <w:rPr>
-          <w:rFonts w:ascii="Calibri Light" w:hAnsi="Calibri Light" w:cs="Calibri Light"/>
-          <w:sz w:val="56"/>
-          <w:szCs w:val="56"/>
-        </w:rPr>
-      </w:pPr>
-      <w:r>
-        <w:rPr>
-          <w:rFonts w:ascii="Calibri Light" w:hAnsi="Calibri Light" w:cs="Calibri Light"/>
-          <w:sz w:val="56"/>
-          <w:szCs w:val="56"/>
-        </w:rPr>
-        <w:t xml:space="preserve">             |</w:t>
-      </w:r>
-    </w:p>
-    <w:p>
-      <w:pPr>
-        <w:rPr>
-          <w:rFonts w:ascii="Calibri Light" w:hAnsi="Calibri Light" w:cs="Calibri Light"/>
-          <w:sz w:val="56"/>
-          <w:szCs w:val="56"/>
-        </w:rPr>
-      </w:pPr>
-      <w:r>
-        <w:rPr>
-          <w:rFonts w:ascii="Calibri Light" w:hAnsi="Calibri Light" w:cs="Calibri Light"/>
-          <w:sz w:val="56"/>
-          <w:szCs w:val="56"/>
-        </w:rPr>
-        <w:t xml:space="preserve">             |</w:t>
-      </w:r>
-    </w:p>
-    <w:p>
-      <w:pPr>
-        <w:rPr>
-          <w:rFonts w:ascii="Calibri Light" w:hAnsi="Calibri Light" w:cs="Calibri Light"/>
-          <w:sz w:val="56"/>
-          <w:szCs w:val="56"/>
-        </w:rPr>
-      </w:pPr>
-      <w:r>
-        <w:rPr>
-          <w:rFonts w:ascii="Calibri Light" w:hAnsi="Calibri Light" w:cs="Calibri Light"/>
-          <w:sz w:val="56"/>
-          <w:szCs w:val="56"/>
-        </w:rPr>
-        <w:t xml:space="preserve">        ENROLLMENTS</w:t>
-      </w:r>
-    </w:p>
-    <w:p>
-      <w:pPr>
-        <w:rPr>
-          <w:rFonts w:ascii="Calibri Light" w:hAnsi="Calibri Light" w:cs="Calibri Light"/>
-          <w:sz w:val="56"/>
-          <w:szCs w:val="56"/>
-        </w:rPr>
-      </w:pPr>
-      <w:r>
-        <w:rPr>
-          <w:rFonts w:ascii="Calibri Light" w:hAnsi="Calibri Light" w:cs="Calibri Light"/>
-          <w:sz w:val="56"/>
-          <w:szCs w:val="56"/>
-        </w:rPr>
-        <w:lastRenderedPageBreak/>
-        <w:t xml:space="preserve">     -----------------</w:t>
-      </w:r>
-    </w:p>
-    <w:p>
-      <w:pPr>
-        <w:rPr>
-          <w:rFonts w:ascii="Calibri Light" w:hAnsi="Calibri Light" w:cs="Calibri Light"/>
-          <w:sz w:val="56"/>
-          <w:szCs w:val="56"/>
-        </w:rPr>
-      </w:pPr>
-      <w:r>
-        <w:rPr>
-          <w:rFonts w:ascii="Calibri Light" w:hAnsi="Calibri Light" w:cs="Calibri Light"/>
-          <w:sz w:val="56"/>
-          <w:szCs w:val="56"/>
-        </w:rPr>
-        <w:t xml:space="preserve">     EnrollmentID (PK)</w:t>
-      </w:r>
-    </w:p>
-    <w:p>
-      <w:pPr>
-        <w:rPr>
-          <w:rFonts w:ascii="Calibri Light" w:hAnsi="Calibri Light" w:cs="Calibri Light"/>
-          <w:sz w:val="56"/>
-          <w:szCs w:val="56"/>
-        </w:rPr>
-      </w:pPr>
-      <w:r>
-        <w:rPr>
-          <w:rFonts w:ascii="Calibri Light" w:hAnsi="Calibri Light" w:cs="Calibri Light"/>
-          <w:sz w:val="56"/>
-          <w:szCs w:val="56"/>
-        </w:rPr>
-        <w:t xml:space="preserve">     StudentID (FK)</w:t>
-      </w:r>
-    </w:p>
-    <w:p>
-      <w:pPr>
-        <w:rPr>
-          <w:rFonts w:ascii="Calibri Light" w:hAnsi="Calibri Light" w:cs="Calibri Light"/>
-          <w:sz w:val="56"/>
-          <w:szCs w:val="56"/>
-        </w:rPr>
-      </w:pPr>
-      <w:r>
-        <w:rPr>
-          <w:rFonts w:ascii="Calibri Light" w:hAnsi="Calibri Light" w:cs="Calibri Light"/>
-          <w:sz w:val="56"/>
-          <w:szCs w:val="56"/>
-        </w:rPr>
-        <w:t xml:space="preserve">     CourseID (FK)</w:t>
-      </w:r>
-    </w:p>
-    <w:p>
-      <w:pPr>
-        <w:rPr>
-          <w:rFonts w:ascii="Calibri Light" w:hAnsi="Calibri Light" w:cs="Calibri Light"/>
-          <w:sz w:val="56"/>
-          <w:szCs w:val="56"/>
-        </w:rPr>
-      </w:pPr>
-      <w:r>
-        <w:rPr>
-          <w:rFonts w:ascii="Calibri Light" w:hAnsi="Calibri Light" w:cs="Calibri Light"/>
-          <w:sz w:val="56"/>
-          <w:szCs w:val="56"/>
-        </w:rPr>
-        <w:t xml:space="preserve">     EnrollmentDate</w:t>
-      </w:r>
-    </w:p>
-    <w:p>
-      <w:pPr>
-        <w:rPr>
-          <w:rFonts w:ascii="Calibri Light" w:hAnsi="Calibri Light" w:cs="Calibri Light"/>
-          <w:sz w:val="56"/>
-          <w:szCs w:val="56"/>
-        </w:rPr>
-      </w:pPr>
-      <w:r>
-        <w:rPr>
-          <w:rFonts w:ascii="Calibri Light" w:hAnsi="Calibri Light" w:cs="Calibri Light"/>
-          <w:sz w:val="56"/>
-          <w:szCs w:val="56"/>
-        </w:rPr>
-        <w:t xml:space="preserve">     Status</w:t>
-      </w:r>
-    </w:p>
-    <w:p>
-      <w:pPr>
-        <w:rPr>
-          <w:rFonts w:ascii="Calibri Light" w:hAnsi="Calibri Light" w:cs="Calibri Light"/>
-          <w:sz w:val="56"/>
-          <w:szCs w:val="56"/>
-        </w:rPr>
-      </w:pPr>
-      <w:r>
-        <w:rPr>
-          <w:rFonts w:ascii="Calibri Light" w:hAnsi="Calibri Light" w:cs="Calibri Light"/>
-          <w:sz w:val="56"/>
-          <w:szCs w:val="56"/>
-        </w:rPr>
-        <w:t xml:space="preserve">             |</w:t>
-      </w:r>
-    </w:p>
-    <w:p>
-      <w:pPr>
-        <w:rPr>
-          <w:rFonts w:ascii="Calibri Light" w:hAnsi="Calibri Light" w:cs="Calibri Light"/>
-          <w:sz w:val="56"/>
-          <w:szCs w:val="56"/>
-        </w:rPr>
-      </w:pPr>
-      <w:r>
-        <w:rPr>
-          <w:rFonts w:ascii="Calibri Light" w:hAnsi="Calibri Light" w:cs="Calibri Light"/>
-          <w:sz w:val="56"/>
-          <w:szCs w:val="56"/>
-        </w:rPr>
-        <w:t xml:space="preserve">             |</w:t>
-      </w:r>
-    </w:p>
-    <w:p>
-      <w:pPr>
-        <w:rPr>
-          <w:rFonts w:ascii="Calibri Light" w:hAnsi="Calibri Light" w:cs="Calibri Light"/>
-          <w:sz w:val="56"/>
-          <w:szCs w:val="56"/>
-        </w:rPr>
-      </w:pPr>
-      <w:r>
-        <w:rPr>
-          <w:rFonts w:ascii="Calibri Light" w:hAnsi="Calibri Light" w:cs="Calibri Light"/>
-          <w:sz w:val="56"/>
-          <w:szCs w:val="56"/>
-        </w:rPr>
-        <w:t xml:space="preserve">         COURSES</w:t>
-      </w:r>
-    </w:p>
-    <w:p>
-      <w:pPr>
-        <w:rPr>
-          <w:rFonts w:ascii="Calibri Light" w:hAnsi="Calibri Light" w:cs="Calibri Light"/>
-          <w:sz w:val="56"/>
-          <w:szCs w:val="56"/>
-        </w:rPr>
-      </w:pPr>
-      <w:r>
-        <w:rPr>
-          <w:rFonts w:ascii="Calibri Light" w:hAnsi="Calibri Light" w:cs="Calibri Light"/>
-          <w:sz w:val="56"/>
-          <w:szCs w:val="56"/>
-        </w:rPr>
-        <w:t xml:space="preserve">      ----------------</w:t>
-      </w:r>
-    </w:p>
-    <w:p>
-      <w:pPr>
-        <w:rPr>
-          <w:rFonts w:ascii="Calibri Light" w:hAnsi="Calibri Light" w:cs="Calibri Light"/>
-          <w:sz w:val="56"/>
-          <w:szCs w:val="56"/>
-        </w:rPr>
-      </w:pPr>
-      <w:r>
-        <w:rPr>
-          <w:rFonts w:ascii="Calibri Light" w:hAnsi="Calibri Light" w:cs="Calibri Light"/>
-          <w:sz w:val="56"/>
-          <w:szCs w:val="56"/>
-        </w:rPr>
-        <w:t xml:space="preserve">      CourseID (PK)</w:t>
-      </w:r>
-    </w:p>
-    <w:p>
-      <w:pPr>
-        <w:rPr>
-          <w:rFonts w:ascii="Calibri Light" w:hAnsi="Calibri Light" w:cs="Calibri Light"/>
-          <w:sz w:val="56"/>
-          <w:szCs w:val="56"/>
-        </w:rPr>
-      </w:pPr>
-      <w:r>
-        <w:rPr>
-          <w:rFonts w:ascii="Calibri Light" w:hAnsi="Calibri Light" w:cs="Calibri Light"/>
-          <w:sz w:val="56"/>
-          <w:szCs w:val="56"/>
-        </w:rPr>
-        <w:t xml:space="preserve">      CourseName</w:t>
-      </w:r>
-    </w:p>
-    <w:p>
-      <w:pPr>
-        <w:rPr>
-          <w:rFonts w:ascii="Calibri Light" w:hAnsi="Calibri Light" w:cs="Calibri Light"/>
-          <w:sz w:val="56"/>
-          <w:szCs w:val="56"/>
-        </w:rPr>
-      </w:pPr>
-      <w:r>
-        <w:rPr>
-          <w:rFonts w:ascii="Calibri Light" w:hAnsi="Calibri Light" w:cs="Calibri Light"/>
-          <w:sz w:val="56"/>
-          <w:szCs w:val="56"/>
-        </w:rPr>
-        <w:t xml:space="preserve">      DepartmentID (FK)</w:t>
-      </w:r>
-    </w:p>
-    <w:p>
-      <w:pPr>
-        <w:rPr>
-          <w:rFonts w:ascii="Calibri Light" w:hAnsi="Calibri Light" w:cs="Calibri Light"/>
-          <w:sz w:val="56"/>
-          <w:szCs w:val="56"/>
-        </w:rPr>
-      </w:pPr>
-      <w:r>
-        <w:rPr>
-          <w:rFonts w:ascii="Calibri Light" w:hAnsi="Calibri Light" w:cs="Calibri Light"/>
-          <w:sz w:val="56"/>
-          <w:szCs w:val="56"/>
-        </w:rPr>
-        <w:lastRenderedPageBreak/>
-        <w:t xml:space="preserve">      Credits</w:t>
-      </w:r>
-    </w:p>
-    <w:p>
-      <w:pPr>
-        <w:rPr>
-          <w:rFonts w:ascii="Calibri Light" w:hAnsi="Calibri Light" w:cs="Calibri Light"/>
-          <w:sz w:val="56"/>
-          <w:szCs w:val="56"/>
-        </w:rPr>
-      </w:pPr>
-      <w:r>
-        <w:rPr>
-          <w:rFonts w:ascii="Calibri Light" w:hAnsi="Calibri Light" w:cs="Calibri Light"/>
-          <w:sz w:val="56"/>
-          <w:szCs w:val="56"/>
-        </w:rPr>
-        <w:t xml:space="preserve">             |</w:t>
-      </w:r>
-    </w:p>
-    <w:p>
-      <w:pPr>
-        <w:rPr>
-          <w:rFonts w:ascii="Calibri Light" w:hAnsi="Calibri Light" w:cs="Calibri Light"/>
-          <w:sz w:val="56"/>
-          <w:szCs w:val="56"/>
-        </w:rPr>
-      </w:pPr>
-      <w:r>
-        <w:rPr>
-          <w:rFonts w:ascii="Calibri Light" w:hAnsi="Calibri Light" w:cs="Calibri Light"/>
-          <w:sz w:val="56"/>
-          <w:szCs w:val="56"/>
-        </w:rPr>
-        <w:t xml:space="preserve">             |</w:t>
-      </w:r>
-    </w:p>
-    <w:p>
-      <w:pPr>
-        <w:rPr>
-          <w:rFonts w:ascii="Calibri Light" w:hAnsi="Calibri Light" w:cs="Calibri Light"/>
-          <w:sz w:val="56"/>
-          <w:szCs w:val="56"/>
-        </w:rPr>
-      </w:pPr>
-      <w:r>
-        <w:rPr>
-          <w:rFonts w:ascii="Calibri Light" w:hAnsi="Calibri Light" w:cs="Calibri Light"/>
-          <w:sz w:val="56"/>
-          <w:szCs w:val="56"/>
-        </w:rPr>
-        <w:t xml:space="preserve">       ASSESSMENTS</w:t>
-      </w:r>
-    </w:p>
-    <w:p>
-      <w:pPr>
-        <w:rPr>
-          <w:rFonts w:ascii="Calibri Light" w:hAnsi="Calibri Light" w:cs="Calibri Light"/>
-          <w:sz w:val="56"/>
-          <w:szCs w:val="56"/>
-        </w:rPr>
-      </w:pPr>
-      <w:r>
-        <w:rPr>
-          <w:rFonts w:ascii="Calibri Light" w:hAnsi="Calibri Light" w:cs="Calibri Light"/>
-          <w:sz w:val="56"/>
-          <w:szCs w:val="56"/>
-        </w:rPr>
-        <w:t xml:space="preserve">      ----------------</w:t>
-      </w:r>
-    </w:p>
-    <w:p>
-      <w:pPr>
-        <w:rPr>
-          <w:rFonts w:ascii="Calibri Light" w:hAnsi="Calibri Light" w:cs="Calibri Light"/>
-          <w:sz w:val="56"/>
-          <w:szCs w:val="56"/>
-        </w:rPr>
-      </w:pPr>
-      <w:r>
-        <w:rPr>
-          <w:rFonts w:ascii="Calibri Light" w:hAnsi="Calibri Light" w:cs="Calibri Light"/>
-          <w:sz w:val="56"/>
-          <w:szCs w:val="56"/>
-        </w:rPr>
-        <w:t xml:space="preserve">      AssessmentID (PK)</w:t>
-      </w:r>
-    </w:p>
-    <w:p>
-      <w:pPr>
-        <w:rPr>
-          <w:rFonts w:ascii="Calibri Light" w:hAnsi="Calibri Light" w:cs="Calibri Light"/>
-          <w:sz w:val="56"/>
-          <w:szCs w:val="56"/>
-        </w:rPr>
-      </w:pPr>
-      <w:r>
-        <w:rPr>
-          <w:rFonts w:ascii="Calibri Light" w:hAnsi="Calibri Light" w:cs="Calibri Light"/>
-          <w:sz w:val="56"/>
-          <w:szCs w:val="56"/>
-        </w:rPr>
-        <w:t xml:space="preserve">      StudentID (FK)</w:t>
-      </w:r>
-    </w:p>
-    <w:p>
-      <w:pPr>
-        <w:rPr>
-          <w:rFonts w:ascii="Calibri Light" w:hAnsi="Calibri Light" w:cs="Calibri Light"/>
-          <w:sz w:val="56"/>
-          <w:szCs w:val="56"/>
-        </w:rPr>
-      </w:pPr>
-      <w:r>
-        <w:rPr>
-          <w:rFonts w:ascii="Calibri Light" w:hAnsi="Calibri Light" w:cs="Calibri Light"/>
-          <w:sz w:val="56"/>
-          <w:szCs w:val="56"/>
-        </w:rPr>
-        <w:t xml:space="preserve">      CourseID (FK)</w:t>
-      </w:r>
-    </w:p>
-    <w:p>
-      <w:pPr>
-        <w:rPr>
-          <w:rFonts w:ascii="Calibri Light" w:hAnsi="Calibri Light" w:cs="Calibri Light"/>
-          <w:sz w:val="56"/>
-          <w:szCs w:val="56"/>
-        </w:rPr>
-      </w:pPr>
-      <w:r>
-        <w:rPr>
-          <w:rFonts w:ascii="Calibri Light" w:hAnsi="Calibri Light" w:cs="Calibri Light"/>
-          <w:sz w:val="56"/>
-          <w:szCs w:val="56"/>
-        </w:rPr>
-        <w:t xml:space="preserve">      CAT1Score</w:t>
-      </w:r>
-    </w:p>
-    <w:p>
-      <w:pPr>
-        <w:rPr>
-          <w:rFonts w:ascii="Calibri Light" w:hAnsi="Calibri Light" w:cs="Calibri Light"/>
-          <w:sz w:val="56"/>
-          <w:szCs w:val="56"/>
-        </w:rPr>
-      </w:pPr>
-      <w:r>
-        <w:rPr>
-          <w:rFonts w:ascii="Calibri Light" w:hAnsi="Calibri Light" w:cs="Calibri Light"/>
-          <w:sz w:val="56"/>
-          <w:szCs w:val="56"/>
-        </w:rPr>
-        <w:t xml:space="preserve">      CAT2Score</w:t>
-      </w:r>
-    </w:p>
-    <w:p>
-      <w:pPr>
-        <w:rPr>
-          <w:rFonts w:ascii="Calibri Light" w:hAnsi="Calibri Light" w:cs="Calibri Light"/>
-          <w:sz w:val="56"/>
-          <w:szCs w:val="56"/>
-        </w:rPr>
-      </w:pPr>
-      <w:r>
-        <w:rPr>
-          <w:rFonts w:ascii="Calibri Light" w:hAnsi="Calibri Light" w:cs="Calibri Light"/>
-          <w:sz w:val="56"/>
-          <w:szCs w:val="56"/>
-        </w:rPr>
-        <w:t xml:space="preserve">      ExamScore</w:t>
-      </w:r>
-    </w:p>
-    <w:p>
-      <w:pPr>
         <w:pStyle w:val="Subtitle"/>
         <w:rPr>
           <w:rFonts w:ascii="Calibri Light" w:hAnsi="Calibri Light" w:cs="Calibri Light"/>
@@ -2578,7 +1795,6 @@
           <w:sz w:val="56"/>
           <w:szCs w:val="56"/>
         </w:rPr>
-        <w:lastRenderedPageBreak/>
         <w:t>First Normal Form (1NF)</w:t>
       </w:r>
     </w:p>
@@ -2697,6 +1913,7 @@
           <w:sz w:val="56"/>
           <w:szCs w:val="56"/>
         </w:rPr>
+        <w:lastRenderedPageBreak/>
         <w:t>The database is in Second Normal Form because:</w:t>
       </w:r>
     </w:p>
@@ -2798,7 +2015,6 @@
           <w:sz w:val="56"/>
           <w:szCs w:val="56"/>
         </w:rPr>
-        <w:lastRenderedPageBreak/>
         <w:t>The database is in Third Normal Form because:</w:t>
       </w:r>
     </w:p>
@@ -2890,7 +2106,7 @@
               <w:tblLook w:val="04A0" w:firstRow="1" w:lastRow="0" w:firstColumn="1" w:lastColumn="0" w:noHBand="0" w:noVBand="1"/>
             </w:tblPr>
             <w:tblGrid>
-              <w:gridCol w:w="5392"/>
+              <w:gridCol w:w="9124"/>
             </w:tblGrid>
             <w:tr>
               <w:tc>
@@ -2912,6 +2128,7 @@
                       <w:sz w:val="56"/>
                       <w:szCs w:val="56"/>
                     </w:rPr>
+                    <w:lastRenderedPageBreak/>
                     <w:t>CRUD MATRIX</w:t>
                   </w:r>
                 </w:p>
@@ -2925,11 +2142,11 @@
               <w:tblLook w:val="04A0" w:firstRow="1" w:lastRow="0" w:firstColumn="1" w:lastColumn="0" w:noHBand="0" w:noVBand="1"/>
             </w:tblPr>
             <w:tblGrid>
-              <w:gridCol w:w="1683"/>
-              <w:gridCol w:w="950"/>
-              <w:gridCol w:w="773"/>
-              <w:gridCol w:w="1038"/>
-              <w:gridCol w:w="948"/>
+              <w:gridCol w:w="2955"/>
+              <w:gridCol w:w="1585"/>
+              <w:gridCol w:w="1254"/>
+              <w:gridCol w:w="1749"/>
+              <w:gridCol w:w="1581"/>
             </w:tblGrid>
             <w:tr>
               <w:tc>
@@ -3216,7 +2433,6 @@
                       <w:sz w:val="56"/>
                       <w:szCs w:val="56"/>
                     </w:rPr>
-                    <w:lastRenderedPageBreak/>
                     <w:t>Students</w:t>
                   </w:r>
                 </w:p>
@@ -3862,6 +3078,7 @@
           <w:sz w:val="56"/>
           <w:szCs w:val="56"/>
         </w:rPr>
+        <w:lastRenderedPageBreak/>
         <w:t>The following SQL operations were successfully implemented:</w:t>
       </w:r>
     </w:p>
@@ -3904,7 +3121,6 @@
           <w:sz w:val="56"/>
           <w:szCs w:val="56"/>
         </w:rPr>
-        <w:lastRenderedPageBreak/>
         <w:t xml:space="preserve">Table creation </w:t>
       </w:r>
     </w:p>
@@ -4136,6 +3352,7 @@
           <w:sz w:val="56"/>
           <w:szCs w:val="56"/>
         </w:rPr>
+        <w:lastRenderedPageBreak/>
         <w:t xml:space="preserve">Database Views </w:t>
       </w:r>
     </w:p>
@@ -4238,7 +3455,7 @@
           <w:sz w:val="56"/>
           <w:szCs w:val="56"/>
         </w:rPr>
-        <w:t xml:space="preserve">The Student Services Management System was successfully designed and implemented using Microsoft SQL Server. The database manages information </w:t>
+        <w:t xml:space="preserve">The Student Services Management System was successfully designed and </w:t>
       </w:r>
       <w:r>
         <w:rPr>
@@ -4247,7 +3464,7 @@
           <w:szCs w:val="56"/>
         </w:rPr>
         <w:lastRenderedPageBreak/>
-        <w:t>relating to students, departments, staff, courses, enrollments, and assessments. The project demonstrates the use of SQL for creating databases, tables, relationships, constraints, queries, and views while maintaining data integrity.</w:t>
+        <w:t>implemented using Microsoft SQL Server. The database manages information relating to students, departments, staff, courses, enrollments, and assessments. The project demonstrates the use of SQL for creating databases, tables, relationships, constraints, queries, and views while maintaining data integrity.</w:t>
       </w:r>
     </w:p>
     <w:p>
@@ -5905,6 +5122,7 @@
   <w:style w:type="character" w:default="1" w:styleId="DefaultParagraphFont">
     <w:name w:val="Default Paragraph Font"/>
     <w:uiPriority w:val="1"/>
+    <w:semiHidden/>
     <w:unhideWhenUsed/>
   </w:style>
   <w:style w:type="table" w:default="1" w:styleId="TableNormal">

</xml_diff>